<commit_message>
Services hover media, section tones, GoPackshot-style navbar and menu
- Navbar: transparent over the hero, solid on scroll; logo scrolls to top on Home;
  transparent logo asset. Phone menu: compact drop-down panel with dimmed page.
- Services: 4 identical blocks; pointing at / swiping to a card shows that
  service's photo (2 short real clips for Video & Film and Product & Retail Video,
  flash frames removed). No card repeats its block's starting photo.
- Section tones: light off-white and deep olive bands, faint olive light + grain
  on dark sections (Home, Services, About, Contact). Black + olive theme kept.
- No repeated photos across Home, About, Services and the Photography page
  (enforced in scripts/validate-data.mjs).
- Fixes: heading colour token for light bands, About preload warning, hero
  heading line spacing, keyboard access for the phone swipe row.

Co-Authored-By: Claude Opus 5.5 <noreply@anthropic.com>
</commit_message>
<xml_diff>
--- a/docs/MAEVEN_Website_Material_Request_v2.docx
+++ b/docs/MAEVEN_Website_Material_Request_v2.docx
@@ -5672,7 +5672,7 @@
           <w:sz w:val="19"/>
           <w:szCs w:val="19"/>
         </w:rPr>
-        <w:t xml:space="preserve">The service structure stays as it is: 3 pillars, 18 services. The page opens with a behind-the-scenes clip from your own footage, then 4 blocks in the same style as the home page: a photo beside a heading and a grid of service cards (name, one-line summary, and "Services included" with the full list). Every service has its own photo from your shoots and footage; the photo moves through the services on its own, and pointing at or tapping a service shows its photo.</w:t>
+        <w:t xml:space="preserve">The service structure stays as it is: 3 pillars, 18 services. Like GoPackshot, the page is 4 identical blocks: one photo with a small label, a heading, one line of text, and a card for each service (name and one-line description).</w:t>
       </w:r>
     </w:p>
     <w:tbl>
@@ -5850,7 +5850,7 @@
                 <w:sz w:val="19"/>
                 <w:szCs w:val="19"/>
               </w:rPr>
-              <w:t xml:space="preserve">Pillar introductions</w:t>
+              <w:t xml:space="preserve">Block texts</w:t>
             </w:r>
           </w:p>
         </w:tc>
@@ -5879,7 +5879,7 @@
                 <w:sz w:val="19"/>
                 <w:szCs w:val="19"/>
               </w:rPr>
-              <w:t xml:space="preserve">One line per pillar, written by us from your service list.</w:t>
+              <w:t xml:space="preserve">One line per block, written by us from your service list.</w:t>
             </w:r>
           </w:p>
         </w:tc>
@@ -6094,7 +6094,7 @@
                 <w:sz w:val="19"/>
                 <w:szCs w:val="19"/>
               </w:rPr>
-              <w:t xml:space="preserve">Service photos</w:t>
+              <w:t xml:space="preserve">Block photos</w:t>
             </w:r>
           </w:p>
         </w:tc>
@@ -6123,7 +6123,7 @@
                 <w:sz w:val="19"/>
                 <w:szCs w:val="19"/>
               </w:rPr>
-              <w:t xml:space="preserve">Content &amp; Production use your real work. Smart Tech and Creative &amp; Brand use behind-the-scenes and campaign photos from your shoots (laptop retouching, studio set, styling, portraits).</w:t>
+              <w:t xml:space="preserve">Photos from your own shoots, labelled with what they show: On-model photography, Digital production, Studio set, Styling.</w:t>
             </w:r>
           </w:p>
         </w:tc>
@@ -6152,129 +6152,7 @@
                 <w:sz w:val="19"/>
                 <w:szCs w:val="19"/>
               </w:rPr>
-              <w:t xml:space="preserve">Real examples of Smart Tech and Creative &amp; Brand work (AI content, 3D renders, AR/VR, brand work). We swap them in one by one.</w:t>
-            </w:r>
-          </w:p>
-        </w:tc>
-        <w:tc>
-          <w:tcPr>
-            <w:tcW w:type="dxa" w:w="1541"/>
-            <w:tcBorders>
-              <w:top w:val="single" w:color="D6D4CC" w:sz="4"/>
-              <w:left w:val="single" w:color="D6D4CC" w:sz="4"/>
-              <w:bottom w:val="single" w:color="D6D4CC" w:sz="4"/>
-              <w:right w:val="single" w:color="D6D4CC" w:sz="4"/>
-            </w:tcBorders>
-            <w:shd w:fill="E7EADF" w:color="auto" w:val="clear"/>
-            <w:tcMar>
-              <w:top w:type="dxa" w:w="90"/>
-              <w:left w:type="dxa" w:w="120"/>
-              <w:bottom w:type="dxa" w:w="90"/>
-              <w:right w:type="dxa" w:w="120"/>
-            </w:tcMar>
-          </w:tcPr>
-          <w:p>
-            <w:r>
-              <w:rPr>
-                <w:rFonts w:ascii="Calibri" w:cs="Calibri" w:eastAsia="Calibri" w:hAnsi="Calibri"/>
-                <w:b/>
-                <w:bCs/>
-                <w:color w:val="4F5E3C"/>
-                <w:sz w:val="17"/>
-                <w:szCs w:val="17"/>
-              </w:rPr>
-              <w:t xml:space="preserve">Strongly recommended</w:t>
-            </w:r>
-          </w:p>
-        </w:tc>
-      </w:tr>
-      <w:tr>
-        <w:tc>
-          <w:tcPr>
-            <w:tcW w:type="dxa" w:w="1928"/>
-            <w:tcBorders>
-              <w:top w:val="single" w:color="D6D4CC" w:sz="4"/>
-              <w:left w:val="single" w:color="D6D4CC" w:sz="4"/>
-              <w:bottom w:val="single" w:color="D6D4CC" w:sz="4"/>
-              <w:right w:val="single" w:color="D6D4CC" w:sz="4"/>
-            </w:tcBorders>
-            <w:tcMar>
-              <w:top w:type="dxa" w:w="90"/>
-              <w:left w:type="dxa" w:w="120"/>
-              <w:bottom w:type="dxa" w:w="90"/>
-              <w:right w:type="dxa" w:w="120"/>
-            </w:tcMar>
-          </w:tcPr>
-          <w:p>
-            <w:r>
-              <w:rPr>
-                <w:rFonts w:ascii="Calibri" w:cs="Calibri" w:eastAsia="Calibri" w:hAnsi="Calibri"/>
-                <w:b/>
-                <w:bCs/>
-                <w:i w:val="false"/>
-                <w:iCs w:val="false"/>
-                <w:sz w:val="19"/>
-                <w:szCs w:val="19"/>
-              </w:rPr>
-              <w:t xml:space="preserve">Photography page</w:t>
-            </w:r>
-          </w:p>
-        </w:tc>
-        <w:tc>
-          <w:tcPr>
-            <w:tcW w:type="dxa" w:w="3470"/>
-            <w:tcBorders>
-              <w:top w:val="single" w:color="D6D4CC" w:sz="4"/>
-              <w:left w:val="single" w:color="D6D4CC" w:sz="4"/>
-              <w:bottom w:val="single" w:color="D6D4CC" w:sz="4"/>
-              <w:right w:val="single" w:color="D6D4CC" w:sz="4"/>
-            </w:tcBorders>
-            <w:tcMar>
-              <w:top w:type="dxa" w:w="90"/>
-              <w:left w:type="dxa" w:w="120"/>
-              <w:bottom w:type="dxa" w:w="90"/>
-              <w:right w:type="dxa" w:w="120"/>
-            </w:tcMar>
-          </w:tcPr>
-          <w:p>
-            <w:r>
-              <w:rPr>
-                <w:rFonts w:ascii="Calibri" w:cs="Calibri" w:eastAsia="Calibri" w:hAnsi="Calibri"/>
-                <w:i w:val="false"/>
-                <w:iCs w:val="false"/>
-                <w:sz w:val="19"/>
-                <w:szCs w:val="19"/>
-              </w:rPr>
-              <w:t xml:space="preserve">Uses your photos and the 5 capabilities from the service sheet.</w:t>
-            </w:r>
-          </w:p>
-        </w:tc>
-        <w:tc>
-          <w:tcPr>
-            <w:tcW w:type="dxa" w:w="2699"/>
-            <w:tcBorders>
-              <w:top w:val="single" w:color="D6D4CC" w:sz="4"/>
-              <w:left w:val="single" w:color="D6D4CC" w:sz="4"/>
-              <w:bottom w:val="single" w:color="D6D4CC" w:sz="4"/>
-              <w:right w:val="single" w:color="D6D4CC" w:sz="4"/>
-            </w:tcBorders>
-            <w:tcMar>
-              <w:top w:type="dxa" w:w="90"/>
-              <w:left w:type="dxa" w:w="120"/>
-              <w:bottom w:type="dxa" w:w="90"/>
-              <w:right w:type="dxa" w:w="120"/>
-            </w:tcMar>
-          </w:tcPr>
-          <w:p>
-            <w:r>
-              <w:rPr>
-                <w:rFonts w:ascii="Calibri" w:cs="Calibri" w:eastAsia="Calibri" w:hAnsi="Calibri"/>
-                <w:i w:val="false"/>
-                <w:iCs w:val="false"/>
-                <w:sz w:val="19"/>
-                <w:szCs w:val="19"/>
-              </w:rPr>
-              <w:t xml:space="preserve">Confirm the 5 capabilities.</w:t>
+              <w:t xml:space="preserve">Real examples of Smart Tech and Creative &amp; Brand work (AI content, 3D renders, AR/VR, brand work), if you want them shown instead.</w:t>
             </w:r>
           </w:p>
         </w:tc>
@@ -6338,6 +6216,128 @@
                 <w:sz w:val="19"/>
                 <w:szCs w:val="19"/>
               </w:rPr>
+              <w:t xml:space="preserve">Photography page</w:t>
+            </w:r>
+          </w:p>
+        </w:tc>
+        <w:tc>
+          <w:tcPr>
+            <w:tcW w:type="dxa" w:w="3470"/>
+            <w:tcBorders>
+              <w:top w:val="single" w:color="D6D4CC" w:sz="4"/>
+              <w:left w:val="single" w:color="D6D4CC" w:sz="4"/>
+              <w:bottom w:val="single" w:color="D6D4CC" w:sz="4"/>
+              <w:right w:val="single" w:color="D6D4CC" w:sz="4"/>
+            </w:tcBorders>
+            <w:tcMar>
+              <w:top w:type="dxa" w:w="90"/>
+              <w:left w:type="dxa" w:w="120"/>
+              <w:bottom w:type="dxa" w:w="90"/>
+              <w:right w:type="dxa" w:w="120"/>
+            </w:tcMar>
+          </w:tcPr>
+          <w:p>
+            <w:r>
+              <w:rPr>
+                <w:rFonts w:ascii="Calibri" w:cs="Calibri" w:eastAsia="Calibri" w:hAnsi="Calibri"/>
+                <w:i w:val="false"/>
+                <w:iCs w:val="false"/>
+                <w:sz w:val="19"/>
+                <w:szCs w:val="19"/>
+              </w:rPr>
+              <w:t xml:space="preserve">Uses your photos and the 5 capabilities from the service sheet.</w:t>
+            </w:r>
+          </w:p>
+        </w:tc>
+        <w:tc>
+          <w:tcPr>
+            <w:tcW w:type="dxa" w:w="2699"/>
+            <w:tcBorders>
+              <w:top w:val="single" w:color="D6D4CC" w:sz="4"/>
+              <w:left w:val="single" w:color="D6D4CC" w:sz="4"/>
+              <w:bottom w:val="single" w:color="D6D4CC" w:sz="4"/>
+              <w:right w:val="single" w:color="D6D4CC" w:sz="4"/>
+            </w:tcBorders>
+            <w:tcMar>
+              <w:top w:type="dxa" w:w="90"/>
+              <w:left w:type="dxa" w:w="120"/>
+              <w:bottom w:type="dxa" w:w="90"/>
+              <w:right w:type="dxa" w:w="120"/>
+            </w:tcMar>
+          </w:tcPr>
+          <w:p>
+            <w:r>
+              <w:rPr>
+                <w:rFonts w:ascii="Calibri" w:cs="Calibri" w:eastAsia="Calibri" w:hAnsi="Calibri"/>
+                <w:i w:val="false"/>
+                <w:iCs w:val="false"/>
+                <w:sz w:val="19"/>
+                <w:szCs w:val="19"/>
+              </w:rPr>
+              <w:t xml:space="preserve">Confirm the 5 capabilities.</w:t>
+            </w:r>
+          </w:p>
+        </w:tc>
+        <w:tc>
+          <w:tcPr>
+            <w:tcW w:type="dxa" w:w="1541"/>
+            <w:tcBorders>
+              <w:top w:val="single" w:color="D6D4CC" w:sz="4"/>
+              <w:left w:val="single" w:color="D6D4CC" w:sz="4"/>
+              <w:bottom w:val="single" w:color="D6D4CC" w:sz="4"/>
+              <w:right w:val="single" w:color="D6D4CC" w:sz="4"/>
+            </w:tcBorders>
+            <w:shd w:fill="F1F0EC" w:color="auto" w:val="clear"/>
+            <w:tcMar>
+              <w:top w:type="dxa" w:w="90"/>
+              <w:left w:type="dxa" w:w="120"/>
+              <w:bottom w:type="dxa" w:w="90"/>
+              <w:right w:type="dxa" w:w="120"/>
+            </w:tcMar>
+          </w:tcPr>
+          <w:p>
+            <w:r>
+              <w:rPr>
+                <w:rFonts w:ascii="Calibri" w:cs="Calibri" w:eastAsia="Calibri" w:hAnsi="Calibri"/>
+                <w:b/>
+                <w:bCs/>
+                <w:color w:val="5F625B"/>
+                <w:sz w:val="17"/>
+                <w:szCs w:val="17"/>
+              </w:rPr>
+              <w:t xml:space="preserve">Optional</w:t>
+            </w:r>
+          </w:p>
+        </w:tc>
+      </w:tr>
+      <w:tr>
+        <w:tc>
+          <w:tcPr>
+            <w:tcW w:type="dxa" w:w="1928"/>
+            <w:tcBorders>
+              <w:top w:val="single" w:color="D6D4CC" w:sz="4"/>
+              <w:left w:val="single" w:color="D6D4CC" w:sz="4"/>
+              <w:bottom w:val="single" w:color="D6D4CC" w:sz="4"/>
+              <w:right w:val="single" w:color="D6D4CC" w:sz="4"/>
+            </w:tcBorders>
+            <w:tcMar>
+              <w:top w:type="dxa" w:w="90"/>
+              <w:left w:type="dxa" w:w="120"/>
+              <w:bottom w:type="dxa" w:w="90"/>
+              <w:right w:type="dxa" w:w="120"/>
+            </w:tcMar>
+          </w:tcPr>
+          <w:p>
+            <w:r>
+              <w:rPr>
+                <w:rFonts w:ascii="Calibri" w:cs="Calibri" w:eastAsia="Calibri" w:hAnsi="Calibri"/>
+                <w:b/>
+                <w:bCs/>
+                <w:i w:val="false"/>
+                <w:iCs w:val="false"/>
+                <w:sz w:val="19"/>
+                <w:szCs w:val="19"/>
+              </w:rPr>
               <w:t xml:space="preserve">Service wording</w:t>
             </w:r>
           </w:p>
@@ -6367,7 +6367,7 @@
                 <w:sz w:val="19"/>
                 <w:szCs w:val="19"/>
               </w:rPr>
-              <w:t xml:space="preserve">Summaries and items from your service spreadsheet. "Smart Tech feature films" looks like a find-and-replace error.</w:t>
+              <w:t xml:space="preserve">Descriptions from your service spreadsheet. "Smart Tech feature films" (in the AI Video &amp; Film list) looks like a find-and-replace error.</w:t>
             </w:r>
           </w:p>
         </w:tc>

</xml_diff>